<commit_message>
Topic 6 Klimsara build: L63/L64/L65 packets + Form B + Unicode render pass
- Topic 6 (6-3, 6-4, 6-5): full LaTeX ingest pipeline (SE+TE), calibration
  files, builders, slides, pacers, and visuals checklists for P1 of each.
- Topic6AssessFormB: trimmed from 17 to 8 items, renumbered 1-8 (student
  section + answer key), comment cross-refs updated. Compiled to 3-page PDF.
- packet_styles: new latex_to_unicode() + render_prompt() helpers for
  pre-render of math tokens (log subscripts, radicals, etc.). 17 builders
  patched; 33 docx files regenerated free of raw-LaTeX paragraphs.
- Savvas source PDFs + LaTeX for 4-3, 4-4, 4-5, 5-1, 5-4, 5-5, 6-3/4/5
  checked in for reproducibility.

Co-Authored-By: Claude Opus 4.7 (1M context) <noreply@anthropic.com>
</commit_message>
<xml_diff>
--- a/L43_P1_Student_Packet.docx
+++ b/L43_P1_Student_Packet.docx
@@ -422,7 +422,7 @@
         <w:rPr>
           <w:sz w:val="22"/>
         </w:rPr>
-        <w:t>Write an expression equivalent to (x-4)/(x) over the domain \{x\mid x\ne 0 or -2\}.</w:t>
+        <w:t>Write an expression equivalent to (x-4)/(x) over the domain \{x\mid x≠ 0 or -2\}.</w:t>
       </w:r>
     </w:p>
     <w:p>
@@ -474,7 +474,7 @@
         <w:t>What is the simplified form of the rational expression? What is the domain?</w:t>
         <w:br/>
         <w:br/>
-        <w:t>(y^2-5y-24)/(y^2+3y)</w:t>
+        <w:t>(y²-5y-24)/(y²+3y)</w:t>
       </w:r>
     </w:p>
     <w:p>
@@ -500,7 +500,7 @@
         <w:t>What is the simplified form of the rational expression? What is the domain?</w:t>
         <w:br/>
         <w:br/>
-        <w:t>(x^2+8x+15)/(x^2-x-12)</w:t>
+        <w:t>(x²+8x+15)/(x²-x-12)</w:t>
       </w:r>
     </w:p>
     <w:p>
@@ -526,10 +526,10 @@
         <w:t>Simplify each expression and state the domain.</w:t>
         <w:br/>
         <w:br/>
-        <w:t>a. (x^2+2x+1)/(x^3-2x^2-3x)</w:t>
+        <w:t>a. (x²+2x+1)/(x³-2x²-3x)</w:t>
         <w:br/>
         <w:br/>
-        <w:t>b. (x^3+4x^2-x-4)/(x^2+3x-4)</w:t>
+        <w:t>b. (x³+4x²-x-4)/(x²+3x-4)</w:t>
       </w:r>
     </w:p>
     <w:p>
@@ -575,7 +575,7 @@
         <w:rPr>
           <w:sz w:val="22"/>
         </w:rPr>
-        <w:t>Reason If the denominator of a rational expression is x^3+3x^2-10x, what value(s) must be restricted from the domain for x?</w:t>
+        <w:t>Reason If the denominator of a rational expression is x³+3x²-10x, what value(s) must be restricted from the domain for x?</w:t>
       </w:r>
     </w:p>
     <w:p>
@@ -847,7 +847,7 @@
         <w:t>What is the simplified form of the rational expression? What is the domain?</w:t>
         <w:br/>
         <w:br/>
-        <w:t>(x^3+9x^2-10x)/(x^3-9x^2-10x)</w:t>
+        <w:t>(x³+9x²-10x)/(x³-9x²-10x)</w:t>
       </w:r>
     </w:p>
     <w:p>

</xml_diff>